<commit_message>
P1: capturas de login con la imagen nueva en manuales y presentaciones de TI.1.1 y TI.1.2
</commit_message>
<xml_diff>
--- a/P1/TI.1.1. PAO202651_SOAP_JAVA_SINBDD_36883_GR07/05. DOCUMENTACION/03. MANUAL DE USUARIO/ManualDeUsuario_GR07.docx
+++ b/P1/TI.1.1. PAO202651_SOAP_JAVA_SINBDD_36883_GR07/05. DOCUMENTACION/03. MANUAL DE USUARIO/ManualDeUsuario_GR07.docx
@@ -6448,7 +6448,7 @@
         <w:lastRenderedPageBreak/>
         <w:drawing>
           <wp:inline distT="0" distB="0" distL="0" distR="0" wp14:anchorId="5CEF70E4" wp14:editId="68CACFB7">
-            <wp:extent cx="3000000" cy="3038793"/>
+            <wp:extent cx="3000000" cy="3271119"/>
             <wp:effectExtent l="0" t="0" r="0" b="0"/>
             <wp:docPr id="9001" name="Ventana de inicio de sesión del cliente de escritorio" descr="Ventana de inicio de sesión del cliente de escritorio"/>
             <wp:cNvGraphicFramePr>
@@ -6470,7 +6470,7 @@
                   <pic:spPr>
                     <a:xfrm>
                       <a:off x="0" y="0"/>
-                      <a:ext cx="3000000" cy="3038793"/>
+                      <a:ext cx="3000000" cy="3271119"/>
                     </a:xfrm>
                     <a:prstGeom prst="rect">
                       <a:avLst/>

</xml_diff>